<commit_message>
Anonymize manuscript for anonymous review
Remove author names from byline and author note; redact affiliation,
correspondence email, identifying funding/acknowledgments, and
pre-registration links. Cover letter and cover page retain names.

Co-Authored-By: Claude Opus 4.8 <noreply@anthropic.com>
</commit_message>
<xml_diff>
--- a/6. Writing & Presentations/OMIT_manuscript_JEPG_2026-06-30_rev6.docx
+++ b/6. Writing & Presentations/OMIT_manuscript_JEPG_2026-06-30_rev6.docx
@@ -15,15 +15,7 @@
         <w:pStyle w:val="Author"/>
       </w:pPr>
       <w:r>
-        <w:t xml:space="preserve">Megan Richardson</w:t>
-      </w:r>
-    </w:p>
-    <w:p>
-      <w:pPr>
-        <w:pStyle w:val="Author"/>
-      </w:pPr>
-      <w:r>
-        <w:t xml:space="preserve">Ashley J. Thomas</w:t>
+        <w:t xml:space="preserve">[Author names removed for anonymous review]</w:t>
       </w:r>
     </w:p>
     <w:p>
@@ -173,7 +165,13 @@
         <w:t xml:space="preserve"> </w:t>
       </w:r>
       <w:r>
-        <w:t xml:space="preserve">approximately 8,100 (text and abstract; excludes title, author note, references, tables, and figure captions).</w:t>
+        <w:t xml:space="preserve">approximately 8,100 (text and abstract; excludes title,</w:t>
+      </w:r>
+      <w:r>
+        <w:t xml:space="preserve"> </w:t>
+      </w:r>
+      <w:r>
+        <w:t xml:space="preserve">author note, references, tables, and figure captions).</w:t>
       </w:r>
     </w:p>
     <w:bookmarkStart w:id="9" w:name="public-significance-statement"/>
@@ -190,7 +188,7 @@
         <w:pStyle w:val="FirstParagraph"/>
       </w:pPr>
       <w:r>
-        <w:t xml:space="preserve">By the time they reach elementary school, children already grasp</w:t>
+        <w:t xml:space="preserve">These studies show that by elementary school, children already grasp</w:t>
       </w:r>
       <w:r>
         <w:t xml:space="preserve"> </w:t>
@@ -202,13 +200,13 @@
         <w:t xml:space="preserve"> </w:t>
       </w:r>
       <w:r>
-        <w:t xml:space="preserve">sharing neutral facts or good news, is a mark of a close relationship:</w:t>
-      </w:r>
-      <w:r>
-        <w:t xml:space="preserve"> </w:t>
-      </w:r>
-      <w:r>
-        <w:t xml:space="preserve">across four studies, six- to nine-year-olds expected people to reveal</w:t>
+        <w:t xml:space="preserve">sharing neutral facts or good news, is a mark of a close relationship.</w:t>
+      </w:r>
+      <w:r>
+        <w:t xml:space="preserve"> </w:t>
+      </w:r>
+      <w:r>
+        <w:t xml:space="preserve">Across four studies, six- to nine-year-olds expected people to reveal</w:t>
       </w:r>
       <w:r>
         <w:t xml:space="preserve"> </w:t>
@@ -220,49 +218,49 @@
         <w:t xml:space="preserve"> </w:t>
       </w:r>
       <w:r>
-        <w:t xml:space="preserve">casual acquaintances or a friend’s parent, and they treated a child</w:t>
-      </w:r>
-      <w:r>
-        <w:t xml:space="preserve"> </w:t>
-      </w:r>
-      <w:r>
-        <w:t xml:space="preserve">confiding in a parent as different from a parent confiding in a child.</w:t>
-      </w:r>
-      <w:r>
-        <w:t xml:space="preserve"> </w:t>
-      </w:r>
-      <w:r>
-        <w:t xml:space="preserve">Yet neither children nor adults viewed opening up emotionally as a way</w:t>
-      </w:r>
-      <w:r>
-        <w:t xml:space="preserve"> </w:t>
-      </w:r>
-      <w:r>
-        <w:t xml:space="preserve">to build a new friendship, suggesting that people intuitively treat</w:t>
-      </w:r>
-      <w:r>
-        <w:t xml:space="preserve"> </w:t>
-      </w:r>
-      <w:r>
-        <w:t xml:space="preserve">emotional intimacy as belonging to relationships that are already close</w:t>
-      </w:r>
-      <w:r>
-        <w:t xml:space="preserve"> </w:t>
-      </w:r>
-      <w:r>
-        <w:t xml:space="preserve">rather than as a tool for creating closeness. These insights may help</w:t>
-      </w:r>
-      <w:r>
-        <w:t xml:space="preserve"> </w:t>
-      </w:r>
-      <w:r>
-        <w:t xml:space="preserve">explain why some children find it difficult to judge what to share, and</w:t>
-      </w:r>
-      <w:r>
-        <w:t xml:space="preserve"> </w:t>
-      </w:r>
-      <w:r>
-        <w:t xml:space="preserve">with whom.</w:t>
+        <w:t xml:space="preserve">friends or a friend’s parent, and they treated a child confiding in a</w:t>
+      </w:r>
+      <w:r>
+        <w:t xml:space="preserve"> </w:t>
+      </w:r>
+      <w:r>
+        <w:t xml:space="preserve">parent as different from a parent confiding in a child. Yet neither</w:t>
+      </w:r>
+      <w:r>
+        <w:t xml:space="preserve"> </w:t>
+      </w:r>
+      <w:r>
+        <w:t xml:space="preserve">children nor adults viewed opening up emotionally as a way to build a</w:t>
+      </w:r>
+      <w:r>
+        <w:t xml:space="preserve"> </w:t>
+      </w:r>
+      <w:r>
+        <w:t xml:space="preserve">new friendship, suggesting that people intuitively treat emotional</w:t>
+      </w:r>
+      <w:r>
+        <w:t xml:space="preserve"> </w:t>
+      </w:r>
+      <w:r>
+        <w:t xml:space="preserve">intimacy as belonging to relationships that are already close rather</w:t>
+      </w:r>
+      <w:r>
+        <w:t xml:space="preserve"> </w:t>
+      </w:r>
+      <w:r>
+        <w:t xml:space="preserve">than as a tool for creating closeness. These insights may help explain</w:t>
+      </w:r>
+      <w:r>
+        <w:t xml:space="preserve"> </w:t>
+      </w:r>
+      <w:r>
+        <w:t xml:space="preserve">why some children find it difficult to judge what to share, and with</w:t>
+      </w:r>
+      <w:r>
+        <w:t xml:space="preserve"> </w:t>
+      </w:r>
+      <w:r>
+        <w:t xml:space="preserve">whom.</w:t>
       </w:r>
     </w:p>
     <w:bookmarkEnd w:id="9"/>
@@ -319,19 +317,19 @@
         <w:t xml:space="preserve">(Clark &amp; Mills, 1979; Fiske, 1992)</w:t>
       </w:r>
       <w:r>
-        <w:t xml:space="preserve">. This distinction seems to be made</w:t>
-      </w:r>
-      <w:r>
-        <w:t xml:space="preserve"> </w:t>
-      </w:r>
-      <w:r>
-        <w:t xml:space="preserve">as early as 4 months: infants expect that those who are physically</w:t>
-      </w:r>
-      <w:r>
-        <w:t xml:space="preserve"> </w:t>
-      </w:r>
-      <w:r>
-        <w:t xml:space="preserve">intimate will respond to one another’s distress</w:t>
+        <w:t xml:space="preserve">. This</w:t>
+      </w:r>
+      <w:r>
+        <w:t xml:space="preserve"> </w:t>
+      </w:r>
+      <w:r>
+        <w:t xml:space="preserve">distinction seems to be made as early as 4 months: infants expect that</w:t>
+      </w:r>
+      <w:r>
+        <w:t xml:space="preserve"> </w:t>
+      </w:r>
+      <w:r>
+        <w:t xml:space="preserve">those who are physically intimate will respond to one another’s distress</w:t>
       </w:r>
       <w:r>
         <w:t xml:space="preserve"> </w:t>
@@ -347,45 +345,31 @@
           <w:b/>
           <w:bCs/>
         </w:rPr>
-        <w:t xml:space="preserve">;</w:t>
-      </w:r>
-      <w:r>
-        <w:rPr>
-          <w:b/>
-          <w:bCs/>
-        </w:rPr>
-        <w:t xml:space="preserve"> </w:t>
-      </w:r>
-      <w:r>
-        <w:rPr>
-          <w:b/>
-          <w:bCs/>
-        </w:rPr>
-        <w:t xml:space="preserve">Woo et al., under review</w:t>
+        <w:t xml:space="preserve">; Woo et al., under review</w:t>
       </w:r>
       <w:r>
         <w:t xml:space="preserve">)</w:t>
       </w:r>
       <w:r>
-        <w:t xml:space="preserve">. One hallmark of such relationships is</w:t>
-      </w:r>
-      <w:r>
-        <w:t xml:space="preserve"> </w:t>
-      </w:r>
-      <w:r>
-        <w:t xml:space="preserve">emotional intimacy, which includes disclosing personal information.</w:t>
-      </w:r>
-      <w:r>
-        <w:t xml:space="preserve"> </w:t>
-      </w:r>
-      <w:r>
-        <w:t xml:space="preserve">Emotional intimacy has been studied across several disciplines, such as</w:t>
-      </w:r>
-      <w:r>
-        <w:t xml:space="preserve"> </w:t>
-      </w:r>
-      <w:r>
-        <w:t xml:space="preserve">Anthropology, Relationship Science</w:t>
+        <w:t xml:space="preserve">. One hallmark of such</w:t>
+      </w:r>
+      <w:r>
+        <w:t xml:space="preserve"> </w:t>
+      </w:r>
+      <w:r>
+        <w:t xml:space="preserve">relationships is emotional intimacy, which includes disclosing personal</w:t>
+      </w:r>
+      <w:r>
+        <w:t xml:space="preserve"> </w:t>
+      </w:r>
+      <w:r>
+        <w:t xml:space="preserve">information. Emotional intimacy has been studied across several</w:t>
+      </w:r>
+      <w:r>
+        <w:t xml:space="preserve"> </w:t>
+      </w:r>
+      <w:r>
+        <w:t xml:space="preserve">disciplines, such as Anthropology, Relationship Science</w:t>
       </w:r>
       <w:r>
         <w:t xml:space="preserve"> </w:t>
@@ -394,19 +378,19 @@
         <w:t xml:space="preserve">(Finkenauer &amp; Buyukcan-Tetik, 2015; Willems et al., 2020)</w:t>
       </w:r>
       <w:r>
-        <w:t xml:space="preserve">, and Sociology. Sociologists have long characterized</w:t>
-      </w:r>
-      <w:r>
-        <w:t xml:space="preserve"> </w:t>
-      </w:r>
-      <w:r>
-        <w:t xml:space="preserve">relationships by the kind of information disclosed within them. More</w:t>
-      </w:r>
-      <w:r>
-        <w:t xml:space="preserve"> </w:t>
-      </w:r>
-      <w:r>
-        <w:t xml:space="preserve">than a century ago,</w:t>
+        <w:t xml:space="preserve">, and Sociology. Sociologists</w:t>
+      </w:r>
+      <w:r>
+        <w:t xml:space="preserve"> </w:t>
+      </w:r>
+      <w:r>
+        <w:t xml:space="preserve">have long characterized relationships by the kind of information</w:t>
+      </w:r>
+      <w:r>
+        <w:t xml:space="preserve"> </w:t>
+      </w:r>
+      <w:r>
+        <w:t xml:space="preserve">disclosed within them. More than a century ago,</w:t>
       </w:r>
       <w:r>
         <w:t xml:space="preserve"> </w:t>
@@ -418,61 +402,55 @@
         <w:t xml:space="preserve"> </w:t>
       </w:r>
       <w:r>
-        <w:t xml:space="preserve">argued that what and how much</w:t>
-      </w:r>
-      <w:r>
-        <w:t xml:space="preserve"> </w:t>
-      </w:r>
-      <w:r>
-        <w:t xml:space="preserve">people reveal to one another is calibrated to the closeness of the</w:t>
-      </w:r>
-      <w:r>
-        <w:t xml:space="preserve"> </w:t>
-      </w:r>
-      <w:r>
-        <w:t xml:space="preserve">relationship: acquaintances share outward, impersonal facts, whereas</w:t>
-      </w:r>
-      <w:r>
-        <w:t xml:space="preserve"> </w:t>
-      </w:r>
-      <w:r>
-        <w:t xml:space="preserve">intimate bonds rest on the disclosure of one’s inner life, including</w:t>
-      </w:r>
-      <w:r>
-        <w:t xml:space="preserve"> </w:t>
-      </w:r>
-      <w:r>
-        <w:t xml:space="preserve">emotions. Contemporary network research operationalizes a version of</w:t>
-      </w:r>
-      <w:r>
-        <w:t xml:space="preserve"> </w:t>
-      </w:r>
-      <w:r>
-        <w:t xml:space="preserve">this idea through the kinds of ties people report—weak ties are those</w:t>
-      </w:r>
-      <w:r>
-        <w:t xml:space="preserve"> </w:t>
-      </w:r>
-      <w:r>
-        <w:t xml:space="preserve">to whom one turns for useful information, while thick ties are those to</w:t>
-      </w:r>
-      <w:r>
-        <w:t xml:space="preserve"> </w:t>
-      </w:r>
-      <w:r>
-        <w:t xml:space="preserve">whom one discloses sensitive or personal matters</w:t>
-      </w:r>
-      <w:r>
-        <w:t xml:space="preserve"> </w:t>
-      </w:r>
-      <w:r>
-        <w:t xml:space="preserve">(refer to Small, 2017,</w:t>
-      </w:r>
-      <w:r>
-        <w:t xml:space="preserve"> </w:t>
-      </w:r>
-      <w:r>
-        <w:t xml:space="preserve">for a history)</w:t>
+        <w:t xml:space="preserve">argued that what and how much people reveal to one another is calibrated</w:t>
+      </w:r>
+      <w:r>
+        <w:t xml:space="preserve"> </w:t>
+      </w:r>
+      <w:r>
+        <w:t xml:space="preserve">to the closeness of the relationship: acquaintances share outward,</w:t>
+      </w:r>
+      <w:r>
+        <w:t xml:space="preserve"> </w:t>
+      </w:r>
+      <w:r>
+        <w:t xml:space="preserve">impersonal facts, whereas intimate bonds rest on the disclosure of one’s</w:t>
+      </w:r>
+      <w:r>
+        <w:t xml:space="preserve"> </w:t>
+      </w:r>
+      <w:r>
+        <w:t xml:space="preserve">inner life, including emotions. Contemporary network research</w:t>
+      </w:r>
+      <w:r>
+        <w:t xml:space="preserve"> </w:t>
+      </w:r>
+      <w:r>
+        <w:t xml:space="preserve">operationalizes a version of this idea through the kinds of ties people</w:t>
+      </w:r>
+      <w:r>
+        <w:t xml:space="preserve"> </w:t>
+      </w:r>
+      <w:r>
+        <w:t xml:space="preserve">report—weak ties are those to whom one turns for useful information,</w:t>
+      </w:r>
+      <w:r>
+        <w:t xml:space="preserve"> </w:t>
+      </w:r>
+      <w:r>
+        <w:t xml:space="preserve">while thick ties are those to whom one discloses sensitive or personal</w:t>
+      </w:r>
+      <w:r>
+        <w:t xml:space="preserve"> </w:t>
+      </w:r>
+      <w:r>
+        <w:t xml:space="preserve">matters</w:t>
+      </w:r>
+      <w:r>
+        <w:t xml:space="preserve"> </w:t>
+      </w:r>
+      <w:r>
+        <w:t xml:space="preserve">(refer to Small, 2017, for a history)</w:t>
       </w:r>
       <w:r>
         <w:t xml:space="preserve">.</w:t>
@@ -3160,43 +3138,43 @@
         <w:t xml:space="preserve"> </w:t>
       </w:r>
       <w:r>
-        <w:t xml:space="preserve">(panels B and C). Descriptively, for the</w:t>
-      </w:r>
-      <w:r>
-        <w:t xml:space="preserve"> </w:t>
-      </w:r>
-      <w:r>
-        <w:t xml:space="preserve">single ice cream cone children chose the classmate told the sad emotion</w:t>
-      </w:r>
-      <w:r>
-        <w:t xml:space="preserve"> </w:t>
-      </w:r>
-      <w:r>
-        <w:t xml:space="preserve">at consistently high rates across ages (about 70% from age 6 onward),</w:t>
-      </w:r>
-      <w:r>
-        <w:t xml:space="preserve"> </w:t>
-      </w:r>
-      <w:r>
-        <w:t xml:space="preserve">whereas in the happy condition this preference was near chance among the</w:t>
-      </w:r>
-      <w:r>
-        <w:t xml:space="preserve"> </w:t>
-      </w:r>
-      <w:r>
-        <w:t xml:space="preserve">youngest children and rose with age, approaching the sad pattern by age</w:t>
-      </w:r>
-      <w:r>
-        <w:t xml:space="preserve"> </w:t>
-      </w:r>
-      <w:r>
-        <w:t xml:space="preserve">9. This corresponds to a three-way emotion × item × age interaction that</w:t>
-      </w:r>
-      <w:r>
-        <w:t xml:space="preserve"> </w:t>
-      </w:r>
-      <w:r>
-        <w:t xml:space="preserve">was not credible</w:t>
+        <w:t xml:space="preserve">(panels B and C). Descriptively, for the single ice cream cone children</w:t>
+      </w:r>
+      <w:r>
+        <w:t xml:space="preserve"> </w:t>
+      </w:r>
+      <w:r>
+        <w:t xml:space="preserve">chose the classmate told the sad emotion at consistently high rates</w:t>
+      </w:r>
+      <w:r>
+        <w:t xml:space="preserve"> </w:t>
+      </w:r>
+      <w:r>
+        <w:t xml:space="preserve">across ages (about 70% from age 6 onward), whereas in the happy</w:t>
+      </w:r>
+      <w:r>
+        <w:t xml:space="preserve"> </w:t>
+      </w:r>
+      <w:r>
+        <w:t xml:space="preserve">condition this preference was near chance among the youngest children</w:t>
+      </w:r>
+      <w:r>
+        <w:t xml:space="preserve"> </w:t>
+      </w:r>
+      <w:r>
+        <w:t xml:space="preserve">and rose with age, approaching the sad pattern by age 9. This</w:t>
+      </w:r>
+      <w:r>
+        <w:t xml:space="preserve"> </w:t>
+      </w:r>
+      <w:r>
+        <w:t xml:space="preserve">corresponds to a three-way emotion × item × age interaction that was not</w:t>
+      </w:r>
+      <w:r>
+        <w:t xml:space="preserve"> </w:t>
+      </w:r>
+      <w:r>
+        <w:t xml:space="preserve">credible</w:t>
       </w:r>
       <w:r>
         <w:t xml:space="preserve"> </w:t>
@@ -3908,19 +3886,19 @@
         </w:r>
       </w:hyperlink>
       <w:r>
-        <w:t xml:space="preserve">, panel B). By 9 years children strongly expected a sad emotion to</w:t>
-      </w:r>
-      <w:r>
-        <w:t xml:space="preserve"> </w:t>
-      </w:r>
-      <w:r>
-        <w:t xml:space="preserve">be shared with the best friend, whereas at 6 years they showed little</w:t>
-      </w:r>
-      <w:r>
-        <w:t xml:space="preserve"> </w:t>
-      </w:r>
-      <w:r>
-        <w:t xml:space="preserve">differentiation (see Supplement, Table S11).</w:t>
+        <w:t xml:space="preserve">, panel B). By 9 years children strongly expected a sad</w:t>
+      </w:r>
+      <w:r>
+        <w:t xml:space="preserve"> </w:t>
+      </w:r>
+      <w:r>
+        <w:t xml:space="preserve">emotion to be shared with the best friend, whereas at 6 years they</w:t>
+      </w:r>
+      <w:r>
+        <w:t xml:space="preserve"> </w:t>
+      </w:r>
+      <w:r>
+        <w:t xml:space="preserve">showed little differentiation (see Supplement, Table S11).</w:t>
       </w:r>
     </w:p>
     <w:bookmarkEnd w:id="32"/>
@@ -4338,7 +4316,13 @@
         </w:r>
       </w:hyperlink>
       <w:r>
-        <w:t xml:space="preserve">, panel A).</w:t>
+        <w:t xml:space="preserve">, panel</w:t>
+      </w:r>
+      <w:r>
+        <w:t xml:space="preserve"> </w:t>
+      </w:r>
+      <w:r>
+        <w:t xml:space="preserve">A).</w:t>
       </w:r>
     </w:p>
     <w:bookmarkEnd w:id="36"/>
@@ -4606,7 +4590,13 @@
         </w:r>
       </w:hyperlink>
       <w:r>
-        <w:t xml:space="preserve">, panel B).</w:t>
+        <w:t xml:space="preserve">, panel</w:t>
+      </w:r>
+      <w:r>
+        <w:t xml:space="preserve"> </w:t>
+      </w:r>
+      <w:r>
+        <w:t xml:space="preserve">B).</w:t>
       </w:r>
     </w:p>
     <w:tbl>
@@ -4914,7 +4904,7 @@
         <w:t xml:space="preserve"> </w:t>
       </w:r>
       <w:r>
-        <w:t xml:space="preserve">symmetric feature of closeness, something both partners dom or as</w:t>
+        <w:t xml:space="preserve">symmetric feature of closeness, something both partners do or as</w:t>
       </w:r>
       <w:r>
         <w:t xml:space="preserve"> </w:t>
@@ -7415,16 +7405,7 @@
         <w:t xml:space="preserve"> </w:t>
       </w:r>
       <w:r>
-        <w:t xml:space="preserve">though this remains to be established</w:t>
-      </w:r>
-      <w:r>
-        <w:t xml:space="preserve"> </w:t>
-      </w:r>
-      <w:r>
-        <w:t xml:space="preserve">(Simons et al., 2017)</w:t>
-      </w:r>
-      <w:r>
-        <w:t xml:space="preserve">.</w:t>
+        <w:t xml:space="preserve">though this remains to be established.</w:t>
       </w:r>
     </w:p>
     <w:bookmarkEnd w:id="61"/>
@@ -7443,13 +7424,7 @@
         <w:pStyle w:val="FirstParagraph"/>
       </w:pPr>
       <w:r>
-        <w:t xml:space="preserve">Megan Richardson and Ashley J. Thomas, Department of Psychology, Harvard</w:t>
-      </w:r>
-      <w:r>
-        <w:t xml:space="preserve"> </w:t>
-      </w:r>
-      <w:r>
-        <w:t xml:space="preserve">University.</w:t>
+        <w:t xml:space="preserve">[Author names and affiliations removed for anonymous review.]</w:t>
       </w:r>
     </w:p>
     <w:p>
@@ -7457,81 +7432,43 @@
         <w:pStyle w:val="BodyText"/>
       </w:pPr>
       <w:r>
-        <w:t xml:space="preserve">This research was supported by the Research Scholar Initiative program</w:t>
-      </w:r>
-      <w:r>
-        <w:t xml:space="preserve"> </w:t>
-      </w:r>
-      <w:r>
-        <w:t xml:space="preserve">at Harvard University, funded by the National Science Foundation. The</w:t>
-      </w:r>
-      <w:r>
-        <w:t xml:space="preserve"> </w:t>
-      </w:r>
-      <w:r>
-        <w:t xml:space="preserve">authors declare no conflicts of interest. The studies’ designs and</w:t>
-      </w:r>
-      <w:r>
-        <w:t xml:space="preserve"> </w:t>
-      </w:r>
-      <w:r>
-        <w:t xml:space="preserve">primary analyses were pre-registered (Studies 1, 3.A, and 4.A:</w:t>
-      </w:r>
-      <w:r>
-        <w:t xml:space="preserve"> </w:t>
-      </w:r>
-      <w:r>
-        <w:t xml:space="preserve">https://osf.io/pv9gj/; Studies 2, 3.B, and 4.B: https://osf.io/sx37c/),</w:t>
-      </w:r>
-      <w:r>
-        <w:t xml:space="preserve"> </w:t>
-      </w:r>
-      <w:r>
-        <w:t xml:space="preserve">and all data, analysis code, and study materials are available on the</w:t>
-      </w:r>
-      <w:r>
-        <w:t xml:space="preserve"> </w:t>
-      </w:r>
-      <w:r>
-        <w:t xml:space="preserve">Open Science Framework at [OSF PROJECT URL].</w:t>
-      </w:r>
-      <w:r>
-        <w:t xml:space="preserve"> </w:t>
-      </w:r>
-      <w:r>
-        <w:rPr>
-          <w:b/>
-          <w:bCs/>
-        </w:rPr>
-        <w:t xml:space="preserve">[Prior dissemination:</w:t>
-      </w:r>
-      <w:r>
-        <w:rPr>
-          <w:b/>
-          <w:bCs/>
-        </w:rPr>
-        <w:t xml:space="preserve"> </w:t>
-      </w:r>
-      <w:r>
-        <w:rPr>
-          <w:b/>
-          <w:bCs/>
-        </w:rPr>
-        <w:t xml:space="preserve">state whether any of these data or ideas were previously presented</w:t>
-      </w:r>
-      <w:r>
-        <w:rPr>
-          <w:b/>
-          <w:bCs/>
-        </w:rPr>
-        <w:t xml:space="preserve"> </w:t>
-      </w:r>
-      <w:r>
-        <w:rPr>
-          <w:b/>
-          <w:bCs/>
-        </w:rPr>
-        <w:t xml:space="preserve">(e.g., at a conference) or posted; if none, say so.]</w:t>
+        <w:t xml:space="preserve">This research was supported by a research fellowship [funder details</w:t>
+      </w:r>
+      <w:r>
+        <w:t xml:space="preserve"> </w:t>
+      </w:r>
+      <w:r>
+        <w:t xml:space="preserve">removed for anonymous review]. The authors declare no conflicts of</w:t>
+      </w:r>
+      <w:r>
+        <w:t xml:space="preserve"> </w:t>
+      </w:r>
+      <w:r>
+        <w:t xml:space="preserve">interest. The studies’ designs and primary analyses were pre-registered</w:t>
+      </w:r>
+      <w:r>
+        <w:t xml:space="preserve"> </w:t>
+      </w:r>
+      <w:r>
+        <w:t xml:space="preserve">(Studies 1, 3.A, and 4.A: [pre-registration link removed for anonymous</w:t>
+      </w:r>
+      <w:r>
+        <w:t xml:space="preserve"> </w:t>
+      </w:r>
+      <w:r>
+        <w:t xml:space="preserve">review]; Studies 2, 3.B, and 4.B: [pre-registration link removed for</w:t>
+      </w:r>
+      <w:r>
+        <w:t xml:space="preserve"> </w:t>
+      </w:r>
+      <w:r>
+        <w:t xml:space="preserve">anonymous review]), and all data, analysis code, and study materials are</w:t>
+      </w:r>
+      <w:r>
+        <w:t xml:space="preserve"> </w:t>
+      </w:r>
+      <w:r>
+        <w:t xml:space="preserve">available at [anonymized repository link].</w:t>
       </w:r>
     </w:p>
     <w:p>
@@ -7539,19 +7476,7 @@
         <w:pStyle w:val="BodyText"/>
       </w:pPr>
       <w:r>
-        <w:t xml:space="preserve">We thank the families who participated, the Harvard Laboratory for</w:t>
-      </w:r>
-      <w:r>
-        <w:t xml:space="preserve"> </w:t>
-      </w:r>
-      <w:r>
-        <w:t xml:space="preserve">Developmental Studies for feedback, and ChildrenHelpingScience.com for</w:t>
-      </w:r>
-      <w:r>
-        <w:t xml:space="preserve"> </w:t>
-      </w:r>
-      <w:r>
-        <w:t xml:space="preserve">support with recruitment.</w:t>
+        <w:t xml:space="preserve">[Acknowledgments removed for anonymous review.]</w:t>
       </w:r>
     </w:p>
     <w:p>
@@ -7559,23 +7484,11 @@
         <w:pStyle w:val="BodyText"/>
       </w:pPr>
       <w:r>
-        <w:t xml:space="preserve">Correspondence concerning this article should be addressed to Ashley J.</w:t>
-      </w:r>
-      <w:r>
-        <w:t xml:space="preserve"> </w:t>
-      </w:r>
-      <w:r>
-        <w:t xml:space="preserve">Thomas, Department of Psychology, Harvard University, Cambridge, MA</w:t>
-      </w:r>
-      <w:r>
-        <w:t xml:space="preserve"> </w:t>
-      </w:r>
-      <w:r>
-        <w:t xml:space="preserve">02138. Email: ashley_thomas@fas.harvard.edu</w:t>
+        <w:t xml:space="preserve">[Correspondence information removed for anonymous review.]</w:t>
       </w:r>
     </w:p>
     <w:bookmarkEnd w:id="63"/>
-    <w:bookmarkStart w:id="118" w:name="references"/>
+    <w:bookmarkStart w:id="116" w:name="references"/>
     <w:p>
       <w:pPr>
         <w:pStyle w:val="Heading1"/>
@@ -7584,7 +7497,7 @@
         <w:t xml:space="preserve">References</w:t>
       </w:r>
     </w:p>
-    <w:bookmarkStart w:id="117" w:name="refs"/>
+    <w:bookmarkStart w:id="115" w:name="refs"/>
     <w:bookmarkStart w:id="65" w:name="ref-afshordi2021"/>
     <w:p>
       <w:pPr>
@@ -8399,60 +8312,7 @@
       </w:r>
     </w:p>
     <w:bookmarkEnd w:id="96"/>
-    <w:bookmarkStart w:id="98" w:name="ref-simons2017constraints"/>
-    <w:p>
-      <w:pPr>
-        <w:pStyle w:val="Bibliography"/>
-      </w:pPr>
-      <w:r>
-        <w:t xml:space="preserve">Simons, D. J., Shoda, Y., &amp; Lindsay, D. S. (2017). Constraints on generality (</w:t>
-      </w:r>
-      <w:r>
-        <w:t xml:space="preserve">COG</w:t>
-      </w:r>
-      <w:r>
-        <w:t xml:space="preserve">): A proposed addition to all empirical papers.</w:t>
-      </w:r>
-      <w:r>
-        <w:t xml:space="preserve"> </w:t>
-      </w:r>
-      <w:r>
-        <w:rPr>
-          <w:i/>
-          <w:iCs/>
-        </w:rPr>
-        <w:t xml:space="preserve">Perspectives on Psychological Science</w:t>
-      </w:r>
-      <w:r>
-        <w:t xml:space="preserve">,</w:t>
-      </w:r>
-      <w:r>
-        <w:t xml:space="preserve"> </w:t>
-      </w:r>
-      <w:r>
-        <w:rPr>
-          <w:i/>
-          <w:iCs/>
-        </w:rPr>
-        <w:t xml:space="preserve">12</w:t>
-      </w:r>
-      <w:r>
-        <w:t xml:space="preserve">(6), 1123–1128.</w:t>
-      </w:r>
-      <w:r>
-        <w:t xml:space="preserve"> </w:t>
-      </w:r>
-      <w:hyperlink r:id="rId97">
-        <w:r>
-          <w:rPr>
-            <w:rStyle w:val="Hyperlink"/>
-          </w:rPr>
-          <w:t xml:space="preserve">https://doi.org/10.1177/1745691617708630</w:t>
-        </w:r>
-      </w:hyperlink>
-    </w:p>
-    <w:bookmarkEnd w:id="98"/>
-    <w:bookmarkStart w:id="100" w:name="ref-small2017"/>
+    <w:bookmarkStart w:id="98" w:name="ref-small2017"/>
     <w:p>
       <w:pPr>
         <w:pStyle w:val="Bibliography"/>
@@ -8479,7 +8339,7 @@
       <w:r>
         <w:t xml:space="preserve"> </w:t>
       </w:r>
-      <w:hyperlink r:id="rId99">
+      <w:hyperlink r:id="rId97">
         <w:r>
           <w:rPr>
             <w:rStyle w:val="Hyperlink"/>
@@ -8488,8 +8348,8 @@
         </w:r>
       </w:hyperlink>
     </w:p>
-    <w:bookmarkEnd w:id="100"/>
-    <w:bookmarkStart w:id="102" w:name="ref-spokes2016"/>
+    <w:bookmarkEnd w:id="98"/>
+    <w:bookmarkStart w:id="100" w:name="ref-spokes2016"/>
     <w:p>
       <w:pPr>
         <w:pStyle w:val="Bibliography"/>
@@ -8526,7 +8386,7 @@
       <w:r>
         <w:t xml:space="preserve"> </w:t>
       </w:r>
-      <w:hyperlink r:id="rId101">
+      <w:hyperlink r:id="rId99">
         <w:r>
           <w:rPr>
             <w:rStyle w:val="Hyperlink"/>
@@ -8535,8 +8395,8 @@
         </w:r>
       </w:hyperlink>
     </w:p>
-    <w:bookmarkEnd w:id="102"/>
-    <w:bookmarkStart w:id="103" w:name="ref-steeleinpress"/>
+    <w:bookmarkEnd w:id="100"/>
+    <w:bookmarkStart w:id="101" w:name="ref-steeleinpress"/>
     <w:p>
       <w:pPr>
         <w:pStyle w:val="Bibliography"/>
@@ -8558,8 +8418,8 @@
         <w:t xml:space="preserve">.</w:t>
       </w:r>
     </w:p>
-    <w:bookmarkEnd w:id="103"/>
-    <w:bookmarkStart w:id="105" w:name="ref-thomas2024"/>
+    <w:bookmarkEnd w:id="101"/>
+    <w:bookmarkStart w:id="103" w:name="ref-thomas2024"/>
     <w:p>
       <w:pPr>
         <w:pStyle w:val="Bibliography"/>
@@ -8583,7 +8443,7 @@
       <w:r>
         <w:t xml:space="preserve"> </w:t>
       </w:r>
-      <w:hyperlink r:id="rId104">
+      <w:hyperlink r:id="rId102">
         <w:r>
           <w:rPr>
             <w:rStyle w:val="Hyperlink"/>
@@ -8592,8 +8452,8 @@
         </w:r>
       </w:hyperlink>
     </w:p>
-    <w:bookmarkEnd w:id="105"/>
-    <w:bookmarkStart w:id="106" w:name="ref-thomas2025caregiving"/>
+    <w:bookmarkEnd w:id="103"/>
+    <w:bookmarkStart w:id="104" w:name="ref-thomas2025caregiving"/>
     <w:p>
       <w:pPr>
         <w:pStyle w:val="Bibliography"/>
@@ -8628,8 +8488,8 @@
         <w:t xml:space="preserve">(1), 14–35.</w:t>
       </w:r>
     </w:p>
-    <w:bookmarkEnd w:id="106"/>
-    <w:bookmarkStart w:id="108" w:name="ref-thomasSaliva2022"/>
+    <w:bookmarkEnd w:id="104"/>
+    <w:bookmarkStart w:id="106" w:name="ref-thomasSaliva2022"/>
     <w:p>
       <w:pPr>
         <w:pStyle w:val="Bibliography"/>
@@ -8666,7 +8526,7 @@
       <w:r>
         <w:t xml:space="preserve"> </w:t>
       </w:r>
-      <w:hyperlink r:id="rId107">
+      <w:hyperlink r:id="rId105">
         <w:r>
           <w:rPr>
             <w:rStyle w:val="Hyperlink"/>
@@ -8675,8 +8535,8 @@
         </w:r>
       </w:hyperlink>
     </w:p>
-    <w:bookmarkEnd w:id="108"/>
-    <w:bookmarkStart w:id="110" w:name="ref-thomsen2020"/>
+    <w:bookmarkEnd w:id="106"/>
+    <w:bookmarkStart w:id="108" w:name="ref-thomsen2020"/>
     <w:p>
       <w:pPr>
         <w:pStyle w:val="Bibliography"/>
@@ -8713,7 +8573,7 @@
       <w:r>
         <w:t xml:space="preserve"> </w:t>
       </w:r>
-      <w:hyperlink r:id="rId109">
+      <w:hyperlink r:id="rId107">
         <w:r>
           <w:rPr>
             <w:rStyle w:val="Hyperlink"/>
@@ -8722,8 +8582,8 @@
         </w:r>
       </w:hyperlink>
     </w:p>
-    <w:bookmarkEnd w:id="110"/>
-    <w:bookmarkStart w:id="112" w:name="ref-vijayakumar2020"/>
+    <w:bookmarkEnd w:id="108"/>
+    <w:bookmarkStart w:id="110" w:name="ref-vijayakumar2020"/>
     <w:p>
       <w:pPr>
         <w:pStyle w:val="Bibliography"/>
@@ -8760,7 +8620,7 @@
       <w:r>
         <w:t xml:space="preserve"> </w:t>
       </w:r>
-      <w:hyperlink r:id="rId111">
+      <w:hyperlink r:id="rId109">
         <w:r>
           <w:rPr>
             <w:rStyle w:val="Hyperlink"/>
@@ -8769,8 +8629,8 @@
         </w:r>
       </w:hyperlink>
     </w:p>
-    <w:bookmarkEnd w:id="112"/>
-    <w:bookmarkStart w:id="113" w:name="ref-wellman2015"/>
+    <w:bookmarkEnd w:id="110"/>
+    <w:bookmarkStart w:id="111" w:name="ref-wellman2015"/>
     <w:p>
       <w:pPr>
         <w:pStyle w:val="Bibliography"/>
@@ -8792,8 +8652,8 @@
         <w:t xml:space="preserve">. Oxford University Press.</w:t>
       </w:r>
     </w:p>
-    <w:bookmarkEnd w:id="113"/>
-    <w:bookmarkStart w:id="114" w:name="ref-willems2020role"/>
+    <w:bookmarkEnd w:id="111"/>
+    <w:bookmarkStart w:id="112" w:name="ref-willems2020role"/>
     <w:p>
       <w:pPr>
         <w:pStyle w:val="Bibliography"/>
@@ -8828,8 +8688,8 @@
         <w:t xml:space="preserve">, 33–37.</w:t>
       </w:r>
     </w:p>
-    <w:bookmarkEnd w:id="114"/>
-    <w:bookmarkStart w:id="116" w:name="ref-woo2024"/>
+    <w:bookmarkEnd w:id="112"/>
+    <w:bookmarkStart w:id="114" w:name="ref-woo2024"/>
     <w:p>
       <w:pPr>
         <w:pStyle w:val="Bibliography"/>
@@ -8866,7 +8726,7 @@
       <w:r>
         <w:t xml:space="preserve"> </w:t>
       </w:r>
-      <w:hyperlink r:id="rId115">
+      <w:hyperlink r:id="rId113">
         <w:r>
           <w:rPr>
             <w:rStyle w:val="Hyperlink"/>
@@ -8875,9 +8735,9 @@
         </w:r>
       </w:hyperlink>
     </w:p>
+    <w:bookmarkEnd w:id="114"/>
+    <w:bookmarkEnd w:id="115"/>
     <w:bookmarkEnd w:id="116"/>
-    <w:bookmarkEnd w:id="117"/>
-    <w:bookmarkEnd w:id="118"/>
     <w:sectPr>
       <w:footnotePr>
         <w:numRestart w:val="eachSect"/>

</xml_diff>